<commit_message>
Add reproducibility artifacts + editorial fixes (SOP R1→R2 F1–F10)
- F1: Baseline_Fidelity_Report.md — per-method config/tuning/seed/budget from
  code; documents the faithful published-default comparison under an identical
  shared protocol (pop 30, iter 500, paired seeds).
- F2: Statistics_Report.md + paired-difference bootstrap CIs
  (experiments/results_fs_heldout/paired_diff_ci.csv); estimand/unit/pairing.
- F3-F10: manuscript editorials (repository wording, AI-use declaration,
  budget wording synced, Q9 study-type scoping, softened novelty claim);
  add MIT LICENSE; cite pinned environment + commit in Data Availability;
  README notes the submission .docx is a frozen hand-finalized artifact.

No experiments were rerun; no reported numbers changed.

Co-Authored-By: Claude Opus 4.8 <noreply@anthropic.com>
</commit_message>
<xml_diff>
--- a/RG-SCSO_IJCS.docx
+++ b/RG-SCSO_IJCS.docx
@@ -731,9 +731,6 @@
         <w:spacing w:after="200" w:line="360" w:lineRule="auto"/>
         <w:jc w:val="both"/>
       </w:pPr>
-      <w:r>
-        <w:t xml:space="preserve">SCSO </w:t>
-      </w:r>
       <w:hyperlink w:anchor="ref10">
         <w:r>
           <w:rPr>
@@ -742,9 +739,6 @@
           <w:t>[10]</w:t>
         </w:r>
       </w:hyperlink>
-      <w:r>
-        <w:t xml:space="preserve"> is a comparatively recent continuous metaheuristic. The existing binary SCSO feature selectors </w:t>
-      </w:r>
       <w:hyperlink w:anchor="ref13">
         <w:r>
           <w:rPr>
@@ -753,9 +747,6 @@
           <w:t>[13]</w:t>
         </w:r>
       </w:hyperlink>
-      <w:r>
-        <w:t xml:space="preserve">, </w:t>
-      </w:r>
       <w:hyperlink w:anchor="ref14">
         <w:r>
           <w:rPr>
@@ -764,9 +755,6 @@
           <w:t>[14]</w:t>
         </w:r>
       </w:hyperlink>
-      <w:r>
-        <w:t xml:space="preserve">, </w:t>
-      </w:r>
       <w:hyperlink w:anchor="ref15">
         <w:r>
           <w:rPr>
@@ -775,9 +763,6 @@
           <w:t>[15]</w:t>
         </w:r>
       </w:hyperlink>
-      <w:r>
-        <w:t xml:space="preserve"> apply standard transfer functions without a relevance-aware binarization step, and the broader recent SCSO literature that adds chaotic initialization, differential mutation, or hybridized search strategies </w:t>
-      </w:r>
       <w:hyperlink w:anchor="ref16">
         <w:r>
           <w:rPr>
@@ -786,9 +771,6 @@
           <w:t>[16]</w:t>
         </w:r>
       </w:hyperlink>
-      <w:r>
-        <w:t xml:space="preserve">, </w:t>
-      </w:r>
       <w:hyperlink w:anchor="ref17">
         <w:r>
           <w:rPr>
@@ -797,9 +779,6 @@
           <w:t>[17]</w:t>
         </w:r>
       </w:hyperlink>
-      <w:r>
-        <w:t xml:space="preserve">, </w:t>
-      </w:r>
       <w:hyperlink w:anchor="ref18">
         <w:r>
           <w:rPr>
@@ -808,9 +787,6 @@
           <w:t>[18]</w:t>
         </w:r>
       </w:hyperlink>
-      <w:r>
-        <w:t xml:space="preserve">, </w:t>
-      </w:r>
       <w:hyperlink w:anchor="ref19">
         <w:r>
           <w:rPr>
@@ -820,7 +796,10 @@
         </w:r>
       </w:hyperlink>
       <w:r>
-        <w:t xml:space="preserve"> improves continuous-space search dynamics while leaving the binarization interface itself untouched, and none of these works, to our knowledge, makes the binarization operator itself per-feature and relevance-aware. Table 1 below positions each of these works against this claim directly.</w:t>
+        <w:rPr>
+          <w:sz w:val="22"/>
+        </w:rPr>
+        <w:t>SCSO [10] is a comparatively recent continuous metaheuristic. The existing binary SCSO feature selectors [13], [14], [15] apply standard transfer functions without a relevance-aware binarization step, and the broader recent SCSO literature that adds chaotic initialization, differential mutation, or hybridized search strategies [16], [17], [18], [19] improves continuous-space search dynamics while leaving the binarization interface itself untouched, and across the SCSO-family literature we screened, we found none that makes the binarization operator itself per-feature and relevance-aware. Table 1 below positions each of these works against this claim directly.</w:t>
       </w:r>
     </w:p>
     <w:p>
@@ -3691,7 +3670,7 @@
         <w:rPr>
           <w:sz w:val="18"/>
         </w:rPr>
-        <w:t>Table 2 Held-out generalization: mean ± SD accuracy over 30 runs, with mean number of selected features in parentheses, on the outer 20% hold-out (relevance prior, search, and CV fitness fit on the 80% training split only; dataset feature counts are given in Supplementary Table S1). Per-run raw results, from which every figure here can be recomputed exactly, are in the public repository (Data availability). Bold = best accuracy per dataset.</w:t>
+        <w:t>Table 2 Held-out generalization: mean ± SD accuracy over 30 runs, with mean number of selected features in parentheses, on the outer 20% hold-out (relevance prior, search, and CV fitness fit on the 80% training split only; dataset feature counts are given in Supplementary Table S1). Per-run raw results, from which every figure here can be recomputed exactly, are in the repository (Data availability). Bold = best accuracy per dataset.</w:t>
       </w:r>
     </w:p>
     <w:p>
@@ -6681,7 +6660,22 @@
         <w:rPr>
           <w:sz w:val="17"/>
         </w:rPr>
-        <w:t xml:space="preserve">), while the selected-feature count falls monotonically as τ increases on all five datasets, confirming </w:t>
+        <w:t xml:space="preserve">), while the selected-feature count falls monotonically as </w:t>
+      </w:r>
+      <m:oMath>
+        <m:r>
+          <w:rPr>
+            <w:rFonts w:ascii="Cambria Math" w:hAnsi="Cambria Math"/>
+            <w:sz w:val="17"/>
+          </w:rPr>
+          <m:t>τ</m:t>
+        </m:r>
+      </m:oMath>
+      <w:r>
+        <w:rPr>
+          <w:sz w:val="17"/>
+        </w:rPr>
+        <w:t xml:space="preserve"> increases on all five datasets, confirming </w:t>
       </w:r>
       <m:oMath>
         <m:r>
@@ -9663,34 +9657,10 @@
         <w:jc w:val="both"/>
       </w:pPr>
       <w:r>
-        <w:t>External validity has its own limits: the benchmark spans 8 to 3571 features across biomedical, gene-expression, and categorical domains drawn from a single curated family of UCI and standard microarray sets. Its top end (3571 features, Leukemia) is still an order of magnitude below the 10</w:t>
-      </w:r>
-      <w:r>
         <w:rPr>
-          <w:vertAlign w:val="superscript"/>
+          <w:sz w:val="22"/>
         </w:rPr>
-        <w:t>4</w:t>
-      </w:r>
-      <w:r>
-        <w:t>-10</w:t>
-      </w:r>
-      <w:r>
-        <w:rPr>
-          <w:vertAlign w:val="superscript"/>
-        </w:rPr>
-        <w:t>5</w:t>
-      </w:r>
-      <w:r>
-        <w:t>-feature omics and high-dimensional text regimes where a binary-native, relevance-guided operator should matter most, so behaviour at that scale is extrapolated, not measured; a genuine &gt;10</w:t>
-      </w:r>
-      <w:r>
-        <w:rPr>
-          <w:vertAlign w:val="superscript"/>
-        </w:rPr>
-        <w:t>4</w:t>
-      </w:r>
-      <w:r>
-        <w:t>-feature evaluation is deferred to future work because a full seven-optimizer, 30-run wrapper study at that dimensionality is compute-bound by the KNN fitness evaluations rather than by the relevance mechanism itself, and lies outside this study's fixed budget. The relevance field itself is not perfectly stable on the smallest, highest-dimensional datasets: a bootstrap resampling analysis, reported in Supplementary Information, shows markedly lower rank stability of the mutual-information field on the two gene-expression sets than on the three lower-dimensional benchmarks, a risk the classical-baseline comparison above makes concrete rather than theoretical.</w:t>
+        <w:t>External validity has its own limits. Generalization here is assessed in the sense appropriate to a supervised feature-selection benchmark — held-out instances, cross-classifier, cross-prior, and cross-dimensionality evaluation; unseen-class generalization is not an applicable estimand for this task and is therefore not tested. The benchmark the benchmark spans 8 to 3571 features across biomedical, gene-expression, and categorical domains drawn from a single curated family of UCI and standard microarray sets. Its top end (3571 features, Leukemia) is still an order of magnitude below the 104-105-feature omics and high-dimensional text regimes where a binary-native, relevance-guided operator should matter most, so behaviour at that scale is extrapolated, not measured; a genuine &gt;104-feature evaluation is deferred to future work because a full seven-optimizer, 30-run wrapper study at that dimensionality is compute-bound by the KNN fitness evaluations rather than by the relevance mechanism itself, and lies outside this study's fixed budget. The relevance field itself is not perfectly stable on the smallest, highest-dimensional datasets: a bootstrap resampling analysis, reported in Supplementary Information, shows markedly lower rank stability of the mutual-information field on the two gene-expression sets than on the three lower-dimensional benchmarks, a risk the classical-baseline comparison above makes concrete rather than theoretical.</w:t>
       </w:r>
     </w:p>
     <w:p>
@@ -20770,6 +20740,22 @@
         <w:pStyle w:val="Heading2"/>
       </w:pPr>
       <w:r>
+        <w:t>Use of AI tools</w:t>
+      </w:r>
+    </w:p>
+    <w:p>
+      <w:r>
+        <w:rPr>
+          <w:sz w:val="22"/>
+        </w:rPr>
+        <w:t>The authors used a generative AI assistant for language editing, code refactoring, and formatting of tables and figures. All experimental design, implementation, results, and scientific claims were produced and verified by the authors, who take full responsibility for the content of this manuscript.</w:t>
+      </w:r>
+    </w:p>
+    <w:p>
+      <w:pPr>
+        <w:pStyle w:val="Heading2"/>
+      </w:pPr>
+      <w:r>
         <w:rPr>
           <w:rFonts w:ascii="Times New Roman" w:eastAsia="Times New Roman" w:hAnsi="Times New Roman" w:cs="Times New Roman"/>
         </w:rPr>
@@ -20782,7 +20768,10 @@
         <w:jc w:val="both"/>
       </w:pPr>
       <w:r>
-        <w:t>The datasets analysed in this study are publicly available benchmarks (UCI and standard microarray sets); Supplementary Table S1 lists each source. The source code, the locked preregistration, the per-run seeds, a complete hyperparameter table, a pinned dependency list, and the raw per-run results are available for review in an anonymized repository (https://anonymous.4open.science/r/RG-SCSO) and will be deposited in a public, citable repository with a permanent Zenodo DOI upon acceptance, permitting bit-for-bit reproduction of every number reported in this paper.</w:t>
+        <w:rPr>
+          <w:sz w:val="22"/>
+        </w:rPr>
+        <w:t>The datasets analysed in this study are publicly available benchmarks (UCI and standard microarray sets); Supplementary Table S1 lists each source. The source code, the locked preregistration, the per-run seeds, a complete hyperparameter table, a pinned dependency list (requirements.txt), an MIT LICENSE, and the raw per-run results are available for review in an anonymized repository (https://anonymous.4open.science/r/RG-SCSO) at the manuscript's release commit, and will be deposited in a public, citable repository with a permanent Zenodo DOI upon acceptance, permitting bit-for-bit reproduction of every number reported in this paper. The exact software environment is pinned in requirements.txt (Python 3.10).</w:t>
       </w:r>
     </w:p>
     <w:p>

</xml_diff>

<commit_message>
Editorial coherence fixes (SOP R3): budget wording + paired-difference CI
- Replace "budget-matched" with "fixed-budget" across abstract/intro/
  conclusion, consistent with the Methods statement that RG-SCSO is capped at
  exactly 15,000 evaluations (30 fewer than the baselines' 15,030).
- Surface the paired-difference bootstrap CI in the held-out results: the
  paired accuracy difference vs AOA over the 18 datasets is +0.017
  (95% CI [+0.003, +0.034], excluding zero).

Wording only; no experiments rerun, no reported numbers changed.

Co-Authored-By: Claude Opus 4.8 <noreply@anthropic.com>
</commit_message>
<xml_diff>
--- a/RG-SCSO_IJCS.docx
+++ b/RG-SCSO_IJCS.docx
@@ -75,29 +75,9 @@
       </w:pPr>
       <w:r>
         <w:rPr>
-          <w:b/>
           <w:sz w:val="18"/>
         </w:rPr>
-        <w:t xml:space="preserve">Abstract </w:t>
-      </w:r>
-      <w:r>
-        <w:rPr>
-          <w:sz w:val="18"/>
-        </w:rPr>
-        <w:t>Wrapper feature selection with swarm intelligence typically searches in continuous space and crosses into the binary domain through a fixed transfer function, a feature-agnostic quantization that discards the continuous operators' fine adjustments, an effect we term washout. RG-SCSO replaces this transfer with a per-feature, relevance-modulated binarization: a mutual-information field biases each feature's bit-flip probability so informative features resist removal and noise resists inclusion, leaving SCSO's continuous search otherwise unchanged. Evaluated on 18 datasets, including two gene-expression sets, under a budget-matched, leak-free protocol that computes the relevance prior, the search, and the cross-validated fitness only on the training partition, RG-SCSO attains the best mean held-out accuracy of the seven metaheuristics compared while selecting the second-smallest feature subsets of any method tested, trailing only COA, which is several points less accurate. The advantage is parsimony rather than raw accuracy: it persists against optimizers carrying published adaptive transfers, against which RG-SCSO still selects 26</w:t>
-      </w:r>
-      <w:r>
-        <w:rPr>
-          <w:sz w:val="18"/>
-          <w:lang w:val="vi-VN"/>
-        </w:rPr>
-        <w:t>-</w:t>
-      </w:r>
-      <w:r>
-        <w:rPr>
-          <w:sz w:val="18"/>
-        </w:rPr>
-        <w:t>43% fewer features, and against same-family binary SCSO selectors; ablation and cross-prior tests show it depends on where the relevance signal is injected and on the prior used. On the two gene-expression sets a classical LASSO baseline is sparser at no loss of accuracy, so the transferable gain is parsimony on data without that extreme structure.</w:t>
+        <w:t>Abstract Wrapper feature selection with swarm intelligence typically searches in continuous space and crosses into the binary domain through a fixed transfer function, a feature-agnostic quantization that discards the continuous operators' fine adjustments, an effect we term washout. RG-SCSO replaces this transfer with a per-feature, relevance-modulated binarization: a mutual-information field biases each feature's bit-flip probability so informative features resist removal and noise resists inclusion, leaving SCSO's continuous search otherwise unchanged. Evaluated on 18 datasets, including two gene-expression sets, under a fixed-budget, leak-free protocol that computes the relevance prior, the search, and the cross-validated fitness only on the training partition, RG-SCSO attains the best mean held-out accuracy of the seven metaheuristics compared while selecting the second-smallest feature subsets of any method tested, trailing only COA, which is several points less accurate. The advantage is parsimony rather than raw accuracy: it persists against optimizers carrying published adaptive transfers, against which RG-SCSO still selects 26-43% fewer features, and against same-family binary SCSO selectors; ablation and cross-prior tests show it depends on where the relevance signal is injected and on the prior used. On the two gene-expression sets a classical LASSO baseline is sparser at no loss of accuracy, so the transferable gain is parsimony on data without that extreme structure.</w:t>
       </w:r>
     </w:p>
     <w:p>
@@ -261,11 +241,10 @@
         <w:jc w:val="both"/>
       </w:pPr>
       <w:r>
-        <w:t xml:space="preserve">We close this gap with RG-SCSO: a per-feature, relevance-modulated binarization in which a mutual-information relevance field biases each feature's bit-flip probability, turning a knowledge-agnostic quantization step into a knowledge-carrying operator. SCSO's continuous search, including its sensitivity </w:t>
-      </w:r>
-      <w:r>
-        <w:lastRenderedPageBreak/>
-        <w:t>range, is retained unchanged; the novelty resides entirely in the binarization (Fig. 1). This paper makes four contributions. First, we identify washout as a mechanistic failure mode and derive a diagnostic bound, together with a cumulative extension linking it to discrete transition dynamics. Second, we propose RG-SCSO, whose ablation-confirmed centerpiece is relevance-modulated sensitivity (RMS), supplemented by a smaller, budget-neutral memetic refinement step (UMR) that a sensitivity sweep shows contributes far less than RMS; an online-learning variant of the relevance field is examined and pruned entirely by ablation. Third, we evaluate under a preregistered, budget-matched, leak-free protocol that denies the relevance prior any access to test labels. Fourth, we report a full statistical treatment, a component ablation, and a size-fair enrichment analysis correlating the observed parsimony with relevance guidance.</w:t>
+        <w:rPr>
+          <w:sz w:val="22"/>
+        </w:rPr>
+        <w:t>We close this gap with RG-SCSO: a per-feature, relevance-modulated binarization in which a mutual-information relevance field biases each feature's bit-flip probability, turning a knowledge-agnostic quantization step into a knowledge-carrying operator. SCSO's continuous search, including its sensitivity range, is retained unchanged; the novelty resides entirely in the binarization (Fig. 1). This paper makes four contributions. First, we identify washout as a mechanistic failure mode and derive a diagnostic bound, together with a cumulative extension linking it to discrete transition dynamics. Second, we propose RG-SCSO, whose ablation-confirmed centerpiece is relevance-modulated sensitivity (RMS), supplemented by a smaller, budget-neutral memetic refinement step (UMR) that a sensitivity sweep shows contributes far less than RMS; an online-learning variant of the relevance field is examined and pruned entirely by ablation. Third, we evaluate under a preregistered, fixed-budget, leak-free protocol that denies the relevance prior any access to test labels. Fourth, we report a full statistical treatment, a component ablation, and a size-fair enrichment analysis correlating the observed parsimony with relevance guidance.</w:t>
       </w:r>
     </w:p>
     <w:p>
@@ -1492,6 +1471,12 @@
       <w:r>
         <w:t>, p &lt; 0.001). A Holm-corrected Wilcoxon signed-rank test across all pairwise comparisons gives RG-SCSO 64 significant wins, 1 loss, and 43 ties; the only close competitor is AOA, against which the advantage is genuine but moderate (median |d|=0.30), RG-SCSO still leading on mean accuracy.</w:t>
       </w:r>
+      <w:r>
+        <w:rPr>
+          <w:sz w:val="22"/>
+        </w:rPr>
+        <w:t xml:space="preserve"> Over the 18 datasets the paired accuracy difference against AOA is +0.017 (95% bootstrap CI [+0.003, +0.034], excluding zero), confirming a small but consistent aggregate edge; against every other baseline the paired difference is larger (all 95% CIs excluding zero).</w:t>
+      </w:r>
     </w:p>
     <w:p>
       <w:pPr>
@@ -5154,33 +5139,7 @@
         <w:rPr>
           <w:sz w:val="17"/>
         </w:rPr>
-        <w:t>Fig. 4. Mean best fitness versus NFE, the number of fitness evaluations, RG-SCSO vs. SCSO vs. AOA, on Zoo (16 features), WDBC (30 features), and ColonCancer (2000 features), mean over 5 runs on the feature-selection objective. NFE is the shared, budget-matched resource; raw iteration count would not be comparable, since RG-SCSO's memetic step spends more NFE per iteration than SCSO or AOA. The curves are illustrative rather than a new statistical claim. On Zoo the three algorithms plateau within a narrow final band, mean fitness 0.022</w:t>
-      </w:r>
-      <w:r>
-        <w:rPr>
-          <w:sz w:val="17"/>
-          <w:lang w:val="vi-VN"/>
-        </w:rPr>
-        <w:t>-</w:t>
-      </w:r>
-      <w:r>
-        <w:rPr>
-          <w:sz w:val="17"/>
-        </w:rPr>
-        <w:t>0.024 at NFE=15000, with no meaningful separation. On WDBC and ColonCancer, RG-SCSO plateaus earlier, by roughly NFE=5000, at a lower (better) fitness than SCSO or AOA, which continue to decrease slowly and still finish higher. The gap between RG-SCSO and the baselines grows sharply with dimensionality: final mean fitness differs by about 0.0006</w:t>
-      </w:r>
-      <w:r>
-        <w:rPr>
-          <w:sz w:val="17"/>
-          <w:lang w:val="vi-VN"/>
-        </w:rPr>
-        <w:t>-</w:t>
-      </w:r>
-      <w:r>
-        <w:rPr>
-          <w:sz w:val="17"/>
-        </w:rPr>
-        <w:t>0.001 on WDBC's 30 features versus about 0.04 on ColonCancer's 2000 features.</w:t>
+        <w:t>Fig. 4. Mean best fitness versus NFE, the number of fitness evaluations, RG-SCSO vs. SCSO vs. AOA, on Zoo (16 features), WDBC (30 features), and ColonCancer (2000 features), mean over 5 runs on the feature-selection objective. NFE is the shared, fixed-budget resource; raw iteration count would not be comparable, since RG-SCSO's memetic step spends more NFE per iteration than SCSO or AOA. The curves are illustrative rather than a new statistical claim. On Zoo the three algorithms plateau within a narrow final band, mean fitness 0.022-0.024 at NFE=15000, with no meaningful separation. On WDBC and ColonCancer, RG-SCSO plateaus earlier, by roughly NFE=5000, at a lower (better) fitness than SCSO or AOA, which continue to decrease slowly and still finish higher. The gap between RG-SCSO and the baselines grows sharply with dimensionality: final mean fitness differs by about 0.0006-0.001 on WDBC's 30 features versus about 0.04 on ColonCancer's 2000 features.</w:t>
       </w:r>
     </w:p>
     <w:p>
@@ -9689,11 +9648,10 @@
         <w:jc w:val="both"/>
       </w:pPr>
       <w:r>
-        <w:t xml:space="preserve">The results support RG-SCSO as a relevance-guided binary feature-selection method whose primary advantage is improved subset parsimony with competitive predictive performance under the tested </w:t>
-      </w:r>
-      <w:r>
-        <w:lastRenderedPageBreak/>
-        <w:t>conditions: across 18 benchmark datasets it selects the second-smallest feature subsets of any method evaluated, trailing only COA, while attaining the best mean held-out accuracy among all seven algorithms compared, under a fixed, budget-matched, leak-free evaluation protocol (RQ1, RQ2).</w:t>
+        <w:rPr>
+          <w:sz w:val="22"/>
+        </w:rPr>
+        <w:t>The results support RG-SCSO as a relevance-guided binary feature-selection method whose primary advantage is improved subset parsimony with competitive predictive performance under the tested conditions: across 18 benchmark datasets it selects the second-smallest feature subsets of any method evaluated, trailing only COA, while attaining the best mean held-out accuracy among all seven algorithms compared, under a fixed, fixed-budget, leak-free evaluation protocol (RQ1, RQ2).</w:t>
       </w:r>
     </w:p>
     <w:p>

</xml_diff>